<commit_message>
Inserindo rodapé com redes sociais
</commit_message>
<xml_diff>
--- a/My_garden.docx
+++ b/My_garden.docx
@@ -5254,6 +5254,94 @@
       </w:r>
     </w:p>
     <w:p/>
+    <w:p>
+      <w:proofErr w:type="spellStart"/>
+      <w:r>
+        <w:t>cd</w:t>
+      </w:r>
+      <w:proofErr w:type="spellEnd"/>
+      <w:r>
+        <w:t xml:space="preserve"> C:\Site\My_stuffs</w:t>
+      </w:r>
+    </w:p>
+    <w:p/>
+    <w:p>
+      <w:proofErr w:type="spellStart"/>
+      <w:r>
+        <w:t>git</w:t>
+      </w:r>
+      <w:proofErr w:type="spellEnd"/>
+      <w:r>
+        <w:t xml:space="preserve"> </w:t>
+      </w:r>
+      <w:proofErr w:type="spellStart"/>
+      <w:proofErr w:type="gramStart"/>
+      <w:r>
+        <w:t>add</w:t>
+      </w:r>
+      <w:proofErr w:type="spellEnd"/>
+      <w:r>
+        <w:t xml:space="preserve"> .</w:t>
+      </w:r>
+      <w:proofErr w:type="gramEnd"/>
+      <w:r>
+        <w:t xml:space="preserve"> </w:t>
+      </w:r>
+    </w:p>
+    <w:p>
+      <w:proofErr w:type="spellStart"/>
+      <w:r>
+        <w:t>git</w:t>
+      </w:r>
+      <w:proofErr w:type="spellEnd"/>
+      <w:r>
+        <w:t xml:space="preserve"> </w:t>
+      </w:r>
+      <w:proofErr w:type="spellStart"/>
+      <w:r>
+        <w:t>commit</w:t>
+      </w:r>
+      <w:proofErr w:type="spellEnd"/>
+      <w:r>
+        <w:t xml:space="preserve"> -m "Atualizando carrossel e textos" </w:t>
+      </w:r>
+    </w:p>
+    <w:p>
+      <w:proofErr w:type="spellStart"/>
+      <w:r>
+        <w:t>git</w:t>
+      </w:r>
+      <w:proofErr w:type="spellEnd"/>
+      <w:r>
+        <w:t xml:space="preserve"> </w:t>
+      </w:r>
+      <w:proofErr w:type="spellStart"/>
+      <w:r>
+        <w:t>push</w:t>
+      </w:r>
+      <w:proofErr w:type="spellEnd"/>
+      <w:r>
+        <w:t xml:space="preserve"> </w:t>
+      </w:r>
+      <w:proofErr w:type="spellStart"/>
+      <w:r>
+        <w:t>origin</w:t>
+      </w:r>
+      <w:proofErr w:type="spellEnd"/>
+      <w:r>
+        <w:t xml:space="preserve"> pessoal</w:t>
+      </w:r>
+    </w:p>
+    <w:p>
+      <w:proofErr w:type="spellStart"/>
+      <w:r>
+        <w:t>alt</w:t>
+      </w:r>
+      <w:proofErr w:type="spellEnd"/>
+      <w:r>
+        <w:t xml:space="preserve"> + 92 = \</w:t>
+      </w:r>
+    </w:p>
     <w:p/>
     <w:sectPr>
       <w:pgSz w:w="11906" w:h="16838"/>

</xml_diff>